<commit_message>
Weekly meetings and Presentation
</commit_message>
<xml_diff>
--- a/docs/meetings/Weekly meetings.docx
+++ b/docs/meetings/Weekly meetings.docx
@@ -5,6 +5,15 @@
     <w:bookmarkStart w:id="0" w:name="_Toc194612684" w:displacedByCustomXml="next"/>
     <w:sdt>
       <w:sdtPr>
+        <w:rPr>
+          <w:rFonts w:asciiTheme="minorHAnsi" w:eastAsiaTheme="minorHAnsi" w:hAnsiTheme="minorHAnsi" w:cstheme="minorBidi"/>
+          <w:color w:val="auto"/>
+          <w:kern w:val="2"/>
+          <w:sz w:val="22"/>
+          <w:szCs w:val="22"/>
+          <w:lang w:val="en-GB"/>
+          <w14:ligatures w14:val="standardContextual"/>
+        </w:rPr>
         <w:id w:val="1900174630"/>
         <w:docPartObj>
           <w:docPartGallery w:val="Table of Contents"/>
@@ -13,16 +22,9 @@
       </w:sdtPr>
       <w:sdtEndPr>
         <w:rPr>
-          <w:rFonts w:asciiTheme="minorHAnsi" w:eastAsiaTheme="minorHAnsi" w:hAnsiTheme="minorHAnsi" w:cstheme="minorBidi"/>
           <w:b/>
           <w:bCs/>
           <w:noProof/>
-          <w:color w:val="auto"/>
-          <w:kern w:val="2"/>
-          <w:sz w:val="22"/>
-          <w:szCs w:val="22"/>
-          <w:lang w:val="en-GB"/>
-          <w14:ligatures w14:val="standardContextual"/>
         </w:rPr>
       </w:sdtEndPr>
       <w:sdtContent>
@@ -1189,18 +1191,14 @@
           <w:u w:val="single"/>
         </w:rPr>
       </w:pPr>
-      <w:bookmarkStart w:id="3" w:name="_Toc194612685"/>
-      <w:bookmarkStart w:id="4" w:name="_Toc227326734"/>
       <w:r>
         <w:rPr>
           <w:rFonts w:eastAsiaTheme="minorHAnsi"/>
           <w:color w:val="auto"/>
           <w:u w:val="single"/>
         </w:rPr>
-        <w:t>Reflection</w:t>
-      </w:r>
-      <w:bookmarkEnd w:id="3"/>
-      <w:bookmarkEnd w:id="4"/>
+        <w:t>Notes</w:t>
+      </w:r>
     </w:p>
     <w:p>
       <w:pPr>
@@ -1249,8 +1247,8 @@
           <w:u w:val="single"/>
         </w:rPr>
       </w:pPr>
-      <w:bookmarkStart w:id="5" w:name="_Toc194612686"/>
-      <w:bookmarkStart w:id="6" w:name="_Toc227326735"/>
+      <w:bookmarkStart w:id="3" w:name="_Toc194612686"/>
+      <w:bookmarkStart w:id="4" w:name="_Toc227326735"/>
       <w:r>
         <w:rPr>
           <w:rFonts w:eastAsiaTheme="minorHAnsi"/>
@@ -1259,7 +1257,7 @@
         </w:rPr>
         <w:t>Week 2</w:t>
       </w:r>
-      <w:bookmarkEnd w:id="5"/>
+      <w:bookmarkEnd w:id="3"/>
       <w:r>
         <w:rPr>
           <w:rFonts w:eastAsiaTheme="minorHAnsi"/>
@@ -1268,7 +1266,7 @@
         </w:rPr>
         <w:t xml:space="preserve"> (In Person)</w:t>
       </w:r>
-      <w:bookmarkEnd w:id="6"/>
+      <w:bookmarkEnd w:id="4"/>
     </w:p>
     <w:p>
       <w:pPr>
@@ -1288,14 +1286,7 @@
           <w:sz w:val="24"/>
           <w:szCs w:val="24"/>
         </w:rPr>
-        <w:t>Azure DevOps</w:t>
-      </w:r>
-      <w:r>
-        <w:rPr>
-          <w:sz w:val="24"/>
-          <w:szCs w:val="24"/>
-        </w:rPr>
-        <w:t xml:space="preserve"> created</w:t>
+        <w:t>Azure DevOps created</w:t>
       </w:r>
       <w:r>
         <w:rPr>
@@ -1441,18 +1432,14 @@
           <w:u w:val="single"/>
         </w:rPr>
       </w:pPr>
-      <w:bookmarkStart w:id="7" w:name="_Toc194612687"/>
-      <w:bookmarkStart w:id="8" w:name="_Toc227326736"/>
       <w:r>
         <w:rPr>
           <w:rFonts w:eastAsiaTheme="minorHAnsi"/>
           <w:color w:val="auto"/>
           <w:u w:val="single"/>
         </w:rPr>
-        <w:t>Reflection</w:t>
-      </w:r>
-      <w:bookmarkEnd w:id="7"/>
-      <w:bookmarkEnd w:id="8"/>
+        <w:t>Notes</w:t>
+      </w:r>
     </w:p>
     <w:p>
       <w:pPr>
@@ -1563,7 +1550,7 @@
           <w:u w:val="single"/>
         </w:rPr>
       </w:pPr>
-      <w:bookmarkStart w:id="9" w:name="_Toc227326737"/>
+      <w:bookmarkStart w:id="5" w:name="_Toc227326737"/>
       <w:r>
         <w:rPr>
           <w:rFonts w:eastAsiaTheme="minorHAnsi"/>
@@ -1581,7 +1568,7 @@
         </w:rPr>
         <w:t>3 (Teams call)</w:t>
       </w:r>
-      <w:bookmarkEnd w:id="9"/>
+      <w:bookmarkEnd w:id="5"/>
     </w:p>
     <w:p>
       <w:pPr>
@@ -1712,16 +1699,14 @@
           <w:u w:val="single"/>
         </w:rPr>
       </w:pPr>
-      <w:bookmarkStart w:id="10" w:name="_Toc227326738"/>
       <w:r>
         <w:rPr>
           <w:rFonts w:eastAsiaTheme="minorHAnsi"/>
           <w:color w:val="auto"/>
           <w:u w:val="single"/>
         </w:rPr>
-        <w:t>Reflection</w:t>
-      </w:r>
-      <w:bookmarkEnd w:id="10"/>
+        <w:t>Notes</w:t>
+      </w:r>
     </w:p>
     <w:p>
       <w:pPr>
@@ -1784,7 +1769,7 @@
           <w:u w:val="single"/>
         </w:rPr>
       </w:pPr>
-      <w:bookmarkStart w:id="11" w:name="_Toc227326739"/>
+      <w:bookmarkStart w:id="6" w:name="_Toc227326739"/>
       <w:r>
         <w:rPr>
           <w:rFonts w:eastAsiaTheme="minorHAnsi"/>
@@ -1799,17 +1784,9 @@
           <w:color w:val="auto"/>
           <w:u w:val="single"/>
         </w:rPr>
-        <w:t>4</w:t>
-      </w:r>
-      <w:r>
-        <w:rPr>
-          <w:rFonts w:eastAsiaTheme="minorHAnsi"/>
-          <w:color w:val="auto"/>
-          <w:u w:val="single"/>
-        </w:rPr>
-        <w:t xml:space="preserve"> (Teams call)</w:t>
-      </w:r>
-      <w:bookmarkEnd w:id="11"/>
+        <w:t>4 (Teams call)</w:t>
+      </w:r>
+      <w:bookmarkEnd w:id="6"/>
     </w:p>
     <w:p>
       <w:pPr>
@@ -1829,14 +1806,7 @@
           <w:sz w:val="24"/>
           <w:szCs w:val="24"/>
         </w:rPr>
-        <w:t xml:space="preserve">SSID: 2308353 </w:t>
-      </w:r>
-      <w:r>
-        <w:rPr>
-          <w:sz w:val="24"/>
-          <w:szCs w:val="24"/>
-        </w:rPr>
-        <w:t>completed the order summary page.</w:t>
+        <w:t>SSID: 2308353 completed the order summary page.</w:t>
       </w:r>
     </w:p>
     <w:p>
@@ -1912,16 +1882,14 @@
           <w:u w:val="single"/>
         </w:rPr>
       </w:pPr>
-      <w:bookmarkStart w:id="12" w:name="_Toc227326740"/>
       <w:r>
         <w:rPr>
           <w:rFonts w:eastAsiaTheme="minorHAnsi"/>
           <w:color w:val="auto"/>
           <w:u w:val="single"/>
         </w:rPr>
-        <w:t>Reflection</w:t>
-      </w:r>
-      <w:bookmarkEnd w:id="12"/>
+        <w:t>Notes</w:t>
+      </w:r>
     </w:p>
     <w:p>
       <w:pPr>
@@ -2018,7 +1986,7 @@
           <w:u w:val="single"/>
         </w:rPr>
       </w:pPr>
-      <w:bookmarkStart w:id="13" w:name="_Toc227326741"/>
+      <w:bookmarkStart w:id="7" w:name="_Toc227326741"/>
       <w:r>
         <w:rPr>
           <w:rFonts w:eastAsiaTheme="minorHAnsi"/>
@@ -2034,33 +2002,9 @@
           <w:color w:val="auto"/>
           <w:u w:val="single"/>
         </w:rPr>
-        <w:t>5</w:t>
-      </w:r>
-      <w:r>
-        <w:rPr>
-          <w:rFonts w:eastAsiaTheme="minorHAnsi"/>
-          <w:color w:val="auto"/>
-          <w:u w:val="single"/>
-        </w:rPr>
-        <w:t xml:space="preserve"> (</w:t>
-      </w:r>
-      <w:r>
-        <w:rPr>
-          <w:rFonts w:eastAsiaTheme="minorHAnsi"/>
-          <w:color w:val="auto"/>
-          <w:u w:val="single"/>
-        </w:rPr>
-        <w:t>In person</w:t>
-      </w:r>
-      <w:r>
-        <w:rPr>
-          <w:rFonts w:eastAsiaTheme="minorHAnsi"/>
-          <w:color w:val="auto"/>
-          <w:u w:val="single"/>
-        </w:rPr>
-        <w:t>)</w:t>
-      </w:r>
-      <w:bookmarkEnd w:id="13"/>
+        <w:t>5 (In person)</w:t>
+      </w:r>
+      <w:bookmarkEnd w:id="7"/>
     </w:p>
     <w:p>
       <w:pPr>
@@ -2080,14 +2024,7 @@
           <w:sz w:val="24"/>
           <w:szCs w:val="24"/>
         </w:rPr>
-        <w:t xml:space="preserve">SSID: </w:t>
-      </w:r>
-      <w:r>
-        <w:rPr>
-          <w:sz w:val="24"/>
-          <w:szCs w:val="24"/>
-        </w:rPr>
-        <w:t>080</w:t>
+        <w:t>SSID: 080</w:t>
       </w:r>
       <w:r>
         <w:rPr>
@@ -2170,16 +2107,14 @@
           <w:u w:val="single"/>
         </w:rPr>
       </w:pPr>
-      <w:bookmarkStart w:id="14" w:name="_Toc227326742"/>
       <w:r>
         <w:rPr>
           <w:rFonts w:eastAsiaTheme="minorHAnsi"/>
           <w:color w:val="auto"/>
           <w:u w:val="single"/>
         </w:rPr>
-        <w:t>Reflection</w:t>
-      </w:r>
-      <w:bookmarkEnd w:id="14"/>
+        <w:t>Notes</w:t>
+      </w:r>
     </w:p>
     <w:p>
       <w:pPr>

</xml_diff>